<commit_message>
Trim the same career framing out of the .docx
SPEC.md was trimmed and the .docx was not, so the repo carried the
original wording in the binary — and the repo is public now. Same five
edits, applied to word/document.xml and re-zipped: the "not a portfolio
project / résumé needs another CRUD app" opener, the "restarted the
habit of building" line on the name, and the "reframed the goal for
personal work" sentence.

Moderna stays. Verified the archive still passes an integrity check and
the text reads correctly after the edit.
</commit_message>
<xml_diff>
--- a/docs/hop-beat-spec-v1.docx
+++ b/docs/hop-beat-spec-v1.docx
@@ -88,7 +88,7 @@
     </w:p>
     <w:p>
       <w:r>
-        <w:t>This is intentionally not a portfolio project built only to demonstrate a framework. The project begins with a real interest: rhythm games, music, movement, interactive visuals, and the question of whether an ordinary webcam can turn physical space into a playable controller. The software should exist because the interaction is interesting, not because a résumé needs another CRUD application.</w:t>
+        <w:t>The project begins with a real interest: rhythm games, music, movement, interactive visuals, and the question of whether an ordinary webcam can turn physical space into a playable controller. The software should exist because the interaction is interesting.</w:t>
       </w:r>
     </w:p>
     <w:p>
@@ -141,12 +141,12 @@
     </w:p>
     <w:p>
       <w:r>
-        <w:t>Working title: hop//beat. The name keeps a subtle lineage with Bunny Hop Player, the project that helped restart the habit of building for curiosity and fun. “hop” connects to physical movement and that earlier project; “beat” describes the rhythm-game core; “//” gives the name a digital/creative-coding character.</w:t>
+        <w:t>Working title: hop//beat. “hop” connects to physical movement, and to Bunny Hop Player; “beat” describes the rhythm-game core; “//” gives the name a digital/creative-coding character.</w:t>
       </w:r>
     </w:p>
     <w:p>
       <w:r>
-        <w:t>The path to this project matters: curiosity about Moderna’s mRNA cancer research led to questions about how biological instructions are engineered, which led to thinking about scientist-facing software and applied projects. That reframed the goal for personal work: build around genuine interests and questions, rather than inventing projects solely to demonstrate a framework. That chain of curiosity eventually became the idea for a webcam-controlled spatial rhythm game.</w:t>
+        <w:t>Where the idea came from: curiosity about Moderna’s mRNA cancer research led to questions about how biological instructions are engineered, which led to thinking about scientist-facing software and applied projects. That chain of curiosity became the idea for a webcam-controlled spatial rhythm game.</w:t>
       </w:r>
     </w:p>
     <w:p>

</xml_diff>